<commit_message>
Added Facade & Iterator
</commit_message>
<xml_diff>
--- a/Task4.docx
+++ b/Task4.docx
@@ -498,8 +498,6 @@
         <w:t>It avoids large conditional statements and keeps scenario-specific names such as “Shipped” outside the engine.</w:t>
       </w:r>
     </w:p>
-    <w:p/>
-    <w:p/>
     <w:p>
       <w:pPr>
         <w:pStyle w:val="Heading1"/>
@@ -807,6 +805,13 @@
         </w:rPr>
         <w:t xml:space="preserve"> without changing the engine.</w:t>
       </w:r>
+    </w:p>
+    <w:p>
+      <w:pPr>
+        <w:rPr>
+          <w:lang w:val="en-ZA"/>
+        </w:rPr>
+      </w:pPr>
     </w:p>
     <w:p>
       <w:pPr>
@@ -1110,10 +1115,9 @@
         <w:t>.</w:t>
       </w:r>
     </w:p>
-    <w:p/>
-    <w:p>
-      <w:pPr>
-        <w:pStyle w:val="Heading2"/>
+    <w:p>
+      <w:pPr>
+        <w:pStyle w:val="Heading1"/>
       </w:pPr>
       <w:r>
         <w:t>Chain of Responsibility – Approval and Escalation</w:t>
@@ -2462,6 +2466,24 @@
     </w:p>
     <w:p>
       <w:pPr>
+        <w:pStyle w:val="ListParagraph"/>
+        <w:ind w:left="768"/>
+        <w:rPr>
+          <w:lang w:val="en-ZA"/>
+        </w:rPr>
+      </w:pPr>
+    </w:p>
+    <w:p>
+      <w:pPr>
+        <w:pStyle w:val="ListParagraph"/>
+        <w:ind w:left="768"/>
+        <w:rPr>
+          <w:lang w:val="en-ZA"/>
+        </w:rPr>
+      </w:pPr>
+    </w:p>
+    <w:p>
+      <w:pPr>
         <w:pStyle w:val="Heading1"/>
         <w:rPr>
           <w:lang w:val="en-ZA"/>
@@ -2471,6 +2493,7 @@
         <w:rPr>
           <w:lang w:val="en-ZA"/>
         </w:rPr>
+        <w:lastRenderedPageBreak/>
         <w:t>Visitor – Monitoring and Reporting</w:t>
       </w:r>
       <w:bookmarkEnd w:id="0"/>
@@ -2504,14 +2527,7 @@
         <w:rPr>
           <w:lang w:val="en-ZA"/>
         </w:rPr>
-        <w:t xml:space="preserve"> walk the whole tree of stages and work items and do </w:t>
-      </w:r>
-      <w:r>
-        <w:rPr>
-          <w:lang w:val="en-ZA"/>
-        </w:rPr>
-        <w:lastRenderedPageBreak/>
-        <w:t xml:space="preserve">something different for each kind. If every report were an operation on </w:t>
+        <w:t xml:space="preserve"> walk the whole tree of stages and work items and do something different for each kind. If every report were an operation on </w:t>
       </w:r>
       <w:proofErr w:type="spellStart"/>
       <w:r>
@@ -3098,40 +3114,12 @@
     </w:p>
     <w:p>
       <w:pPr>
+        <w:pStyle w:val="Heading1"/>
         <w:rPr>
           <w:lang w:val="en-ZA"/>
         </w:rPr>
       </w:pPr>
       <w:bookmarkStart w:id="2" w:name="proxy-access-control"/>
-    </w:p>
-    <w:p>
-      <w:pPr>
-        <w:rPr>
-          <w:lang w:val="en-ZA"/>
-        </w:rPr>
-      </w:pPr>
-    </w:p>
-    <w:p>
-      <w:pPr>
-        <w:rPr>
-          <w:lang w:val="en-ZA"/>
-        </w:rPr>
-      </w:pPr>
-    </w:p>
-    <w:p>
-      <w:pPr>
-        <w:rPr>
-          <w:lang w:val="en-ZA"/>
-        </w:rPr>
-      </w:pPr>
-    </w:p>
-    <w:p>
-      <w:pPr>
-        <w:pStyle w:val="Heading1"/>
-        <w:rPr>
-          <w:lang w:val="en-ZA"/>
-        </w:rPr>
-      </w:pPr>
       <w:r>
         <w:rPr>
           <w:lang w:val="en-ZA"/>
@@ -3635,7 +3623,7 @@
           <w:lang w:val="en-US"/>
         </w:rPr>
         <w:lastRenderedPageBreak/>
-        <w:t>Facade:</w:t>
+        <w:t>Facade</w:t>
       </w:r>
     </w:p>
     <w:p>
@@ -3667,7 +3655,7 @@
         <w:rPr>
           <w:lang w:val="en-US"/>
         </w:rPr>
-        <w:t>Participants:</w:t>
+        <w:t>Participants</w:t>
       </w:r>
     </w:p>
     <w:p>
@@ -4075,6 +4063,84 @@
     </w:p>
     <w:p>
       <w:pPr>
+        <w:rPr>
+          <w:b/>
+          <w:bCs/>
+          <w:sz w:val="28"/>
+          <w:szCs w:val="28"/>
+        </w:rPr>
+      </w:pPr>
+      <w:r>
+        <w:rPr>
+          <w:rStyle w:val="Heading2Char"/>
+        </w:rPr>
+        <w:t>What part of the design is expected to vary</w:t>
+      </w:r>
+    </w:p>
+    <w:p>
+      <w:pPr>
+        <w:pStyle w:val="ListParagraph"/>
+        <w:numPr>
+          <w:ilvl w:val="0"/>
+          <w:numId w:val="17"/>
+        </w:numPr>
+      </w:pPr>
+      <w:r>
+        <w:t xml:space="preserve">The specific client applications integrating with TIVIDY (such as </w:t>
+      </w:r>
+      <w:proofErr w:type="spellStart"/>
+      <w:r>
+        <w:t>ArkhamExpress</w:t>
+      </w:r>
+      <w:proofErr w:type="spellEnd"/>
+      <w:r>
+        <w:t xml:space="preserve">) and the sequence of internal subsystem interactions (using components like </w:t>
+      </w:r>
+      <w:proofErr w:type="spellStart"/>
+      <w:r>
+        <w:t>HistoryManager</w:t>
+      </w:r>
+      <w:proofErr w:type="spellEnd"/>
+      <w:r>
+        <w:t xml:space="preserve"> and </w:t>
+      </w:r>
+      <w:proofErr w:type="spellStart"/>
+      <w:r>
+        <w:t>EventSource</w:t>
+      </w:r>
+      <w:proofErr w:type="spellEnd"/>
+      <w:r>
+        <w:t>) required to perform high-level workflow operations.</w:t>
+      </w:r>
+    </w:p>
+    <w:p>
+      <w:pPr>
+        <w:rPr>
+          <w:sz w:val="28"/>
+          <w:szCs w:val="28"/>
+        </w:rPr>
+      </w:pPr>
+      <w:r>
+        <w:rPr>
+          <w:rStyle w:val="Heading2Char"/>
+        </w:rPr>
+        <w:t>Why the selected pattern is appropriate</w:t>
+      </w:r>
+    </w:p>
+    <w:p>
+      <w:pPr>
+        <w:pStyle w:val="ListParagraph"/>
+        <w:numPr>
+          <w:ilvl w:val="0"/>
+          <w:numId w:val="17"/>
+        </w:numPr>
+      </w:pPr>
+      <w:r>
+        <w:t>It completely decouples external business systems from the complex internal architecture of the workflow engine. By providing a simplified entry point, the engine's internal classes can be independently modified or expanded without breaking the external applications that rely on it to start and manage workflow instances.</w:t>
+      </w:r>
+    </w:p>
+    <w:p>
+      <w:pPr>
         <w:pStyle w:val="Heading1"/>
         <w:rPr>
           <w:lang w:val="en-US"/>
@@ -4084,6 +4150,7 @@
         <w:rPr>
           <w:lang w:val="en-US"/>
         </w:rPr>
+        <w:lastRenderedPageBreak/>
         <w:t>Iterator</w:t>
       </w:r>
     </w:p>
@@ -4342,24 +4409,118 @@
     </w:p>
     <w:p>
       <w:pPr>
+        <w:pStyle w:val="Heading2"/>
         <w:rPr>
           <w:lang w:val="en-US"/>
         </w:rPr>
       </w:pPr>
-    </w:p>
-    <w:p>
-      <w:pPr>
-        <w:pStyle w:val="Heading2"/>
+      <w:r>
         <w:rPr>
           <w:lang w:val="en-US"/>
         </w:rPr>
-      </w:pPr>
-      <w:r>
+        <w:t>How it works</w:t>
+      </w:r>
+    </w:p>
+    <w:p>
+      <w:pPr>
+        <w:pStyle w:val="ListParagraph"/>
+        <w:numPr>
+          <w:ilvl w:val="0"/>
+          <w:numId w:val="19"/>
+        </w:numPr>
         <w:rPr>
           <w:lang w:val="en-US"/>
         </w:rPr>
-        <w:lastRenderedPageBreak/>
-        <w:t>How it works</w:t>
+      </w:pPr>
+      <w:r>
+        <w:rPr>
+          <w:lang w:val="en-ZA"/>
+        </w:rPr>
+        <w:t xml:space="preserve">Instead of the </w:t>
+      </w:r>
+      <w:proofErr w:type="spellStart"/>
+      <w:r>
+        <w:rPr>
+          <w:lang w:val="en-ZA"/>
+        </w:rPr>
+        <w:t>WorkflowInstance</w:t>
+      </w:r>
+      <w:proofErr w:type="spellEnd"/>
+      <w:r>
+        <w:rPr>
+          <w:lang w:val="en-ZA"/>
+        </w:rPr>
+        <w:t xml:space="preserve"> writing a giant loop to check every nested stage for available tasks, it just asks the root Stage for an </w:t>
+      </w:r>
+      <w:proofErr w:type="spellStart"/>
+      <w:r>
+        <w:rPr>
+          <w:lang w:val="en-ZA"/>
+        </w:rPr>
+        <w:t>AvailableWorkIterator</w:t>
+      </w:r>
+      <w:proofErr w:type="spellEnd"/>
+      <w:r>
+        <w:rPr>
+          <w:lang w:val="en-ZA"/>
+        </w:rPr>
+        <w:t xml:space="preserve">. The engine can step through </w:t>
+      </w:r>
+      <w:proofErr w:type="spellStart"/>
+      <w:r>
+        <w:rPr>
+          <w:lang w:val="en-ZA"/>
+        </w:rPr>
+        <w:t>iterator.next</w:t>
+      </w:r>
+      <w:proofErr w:type="spellEnd"/>
+      <w:r>
+        <w:rPr>
+          <w:lang w:val="en-ZA"/>
+        </w:rPr>
+        <w:t xml:space="preserve">() to assign tasks via the </w:t>
+      </w:r>
+      <w:proofErr w:type="spellStart"/>
+      <w:r>
+        <w:rPr>
+          <w:lang w:val="en-ZA"/>
+        </w:rPr>
+        <w:t>AssignmentRule</w:t>
+      </w:r>
+      <w:proofErr w:type="spellEnd"/>
+      <w:r>
+        <w:rPr>
+          <w:lang w:val="en-ZA"/>
+        </w:rPr>
+        <w:t xml:space="preserve"> Strategy, completely ignorant of how deeply nested the workflow structure </w:t>
+      </w:r>
+      <w:proofErr w:type="gramStart"/>
+      <w:r>
+        <w:rPr>
+          <w:lang w:val="en-ZA"/>
+        </w:rPr>
+        <w:t>actually is</w:t>
+      </w:r>
+      <w:proofErr w:type="gramEnd"/>
+      <w:r>
+        <w:rPr>
+          <w:lang w:val="en-ZA"/>
+        </w:rPr>
+        <w:t>.</w:t>
+      </w:r>
+    </w:p>
+    <w:p>
+      <w:pPr>
+        <w:rPr>
+          <w:sz w:val="28"/>
+          <w:szCs w:val="28"/>
+        </w:rPr>
+      </w:pPr>
+      <w:r>
+        <w:rPr>
+          <w:rStyle w:val="Heading2Char"/>
+        </w:rPr>
+        <w:t>What part of the design is expected to vary</w:t>
       </w:r>
     </w:p>
     <w:p>
@@ -4367,88 +4528,64 @@
         <w:pStyle w:val="ListParagraph"/>
         <w:numPr>
           <w:ilvl w:val="0"/>
-          <w:numId w:val="19"/>
+          <w:numId w:val="17"/>
+        </w:numPr>
+      </w:pPr>
+      <w:r>
+        <w:t xml:space="preserve">The traversal algorithms used to navigate the workflow execution (e.g., finding the next available tasks versus auditing failed tasks) and the internal tree-like structure of nested </w:t>
+      </w:r>
+      <w:proofErr w:type="spellStart"/>
+      <w:r>
+        <w:t>WorkFlowComponent</w:t>
+      </w:r>
+      <w:proofErr w:type="spellEnd"/>
+      <w:r>
+        <w:t xml:space="preserve"> and Stage objects.</w:t>
+      </w:r>
+    </w:p>
+    <w:p>
+      <w:pPr>
+        <w:rPr>
+          <w:sz w:val="28"/>
+          <w:szCs w:val="28"/>
+        </w:rPr>
+      </w:pPr>
+      <w:r>
+        <w:rPr>
+          <w:rStyle w:val="Heading2Char"/>
+        </w:rPr>
+        <w:t>Why the selected pattern is appropriate</w:t>
+      </w:r>
+    </w:p>
+    <w:p>
+      <w:pPr>
+        <w:pStyle w:val="ListParagraph"/>
+        <w:numPr>
+          <w:ilvl w:val="0"/>
+          <w:numId w:val="17"/>
         </w:numPr>
         <w:rPr>
           <w:lang w:val="en-US"/>
         </w:rPr>
       </w:pPr>
       <w:r>
-        <w:rPr>
-          <w:lang w:val="en-ZA"/>
-        </w:rPr>
-        <w:t xml:space="preserve">Instead of the </w:t>
-      </w:r>
-      <w:proofErr w:type="spellStart"/>
-      <w:r>
-        <w:rPr>
-          <w:lang w:val="en-ZA"/>
-        </w:rPr>
-        <w:t>WorkflowInstance</w:t>
-      </w:r>
-      <w:proofErr w:type="spellEnd"/>
-      <w:r>
-        <w:rPr>
-          <w:lang w:val="en-ZA"/>
-        </w:rPr>
-        <w:t xml:space="preserve"> writing a giant loop to check every nested stage for available tasks, it just asks the root Stage for an </w:t>
-      </w:r>
-      <w:proofErr w:type="spellStart"/>
-      <w:r>
-        <w:rPr>
-          <w:lang w:val="en-ZA"/>
-        </w:rPr>
-        <w:t>AvailableWorkIterator</w:t>
-      </w:r>
-      <w:proofErr w:type="spellEnd"/>
-      <w:r>
-        <w:rPr>
-          <w:lang w:val="en-ZA"/>
-        </w:rPr>
-        <w:t xml:space="preserve">. The engine can step through </w:t>
-      </w:r>
-      <w:proofErr w:type="spellStart"/>
-      <w:r>
-        <w:rPr>
-          <w:lang w:val="en-ZA"/>
-        </w:rPr>
-        <w:t>iterator.next</w:t>
-      </w:r>
-      <w:proofErr w:type="spellEnd"/>
-      <w:r>
-        <w:rPr>
-          <w:lang w:val="en-ZA"/>
-        </w:rPr>
-        <w:t xml:space="preserve">() to assign tasks via the </w:t>
-      </w:r>
-      <w:proofErr w:type="spellStart"/>
-      <w:r>
-        <w:rPr>
-          <w:lang w:val="en-ZA"/>
-        </w:rPr>
-        <w:t>AssignmentRule</w:t>
-      </w:r>
-      <w:proofErr w:type="spellEnd"/>
-      <w:r>
-        <w:rPr>
-          <w:lang w:val="en-ZA"/>
-        </w:rPr>
-        <w:t xml:space="preserve"> Strategy, completely ignorant of how deeply nested the workflow structure </w:t>
-      </w:r>
-      <w:proofErr w:type="gramStart"/>
-      <w:r>
-        <w:rPr>
-          <w:lang w:val="en-ZA"/>
-        </w:rPr>
-        <w:t>actually is</w:t>
-      </w:r>
-      <w:proofErr w:type="gramEnd"/>
-      <w:r>
-        <w:rPr>
-          <w:lang w:val="en-ZA"/>
-        </w:rPr>
-        <w:t>.</w:t>
-      </w:r>
+        <w:t xml:space="preserve">It prevents the Stage and </w:t>
+      </w:r>
+      <w:proofErr w:type="spellStart"/>
+      <w:r>
+        <w:t>WorkItem</w:t>
+      </w:r>
+      <w:proofErr w:type="spellEnd"/>
+      <w:r>
+        <w:t xml:space="preserve"> classes from being bloated with navigation logic. The engine can sequentially access specific tasks without needing to understand or parse the underlying complexity of the nested composite tree.</w:t>
+      </w:r>
+    </w:p>
+    <w:p>
+      <w:pPr>
+        <w:rPr>
+          <w:lang w:val="en-US"/>
+        </w:rPr>
+      </w:pPr>
     </w:p>
     <w:p/>
     <w:p>
@@ -4839,7 +4976,7 @@
   <w:abstractNum w:abstractNumId="3" w15:restartNumberingAfterBreak="0">
     <w:nsid w:val="1DA50361"/>
     <w:multiLevelType w:val="hybridMultilevel"/>
-    <w:tmpl w:val="38767D8E"/>
+    <w:tmpl w:val="01B82BD8"/>
     <w:lvl w:ilvl="0" w:tplc="08090001">
       <w:start w:val="1"/>
       <w:numFmt w:val="bullet"/>

</xml_diff>